<commit_message>
Document structured pruning for FPGA deployment
</commit_message>
<xml_diff>
--- a/docs/de_xuat_kien_truc_host_fpga.docx
+++ b/docs/de_xuat_kien_truc_host_fpga.docx
@@ -4162,6 +4162,460 @@
     </w:p>
     <w:p>
       <w:pPr>
+        <w:pStyle w:val="Heading2"/>
+        <w:keepNext/>
+      </w:pPr>
+      <w:r>
+        <w:t>5.1. Vai trò của structured pruning trong phương án FPGA</w:t>
+      </w:r>
+    </w:p>
+    <w:p>
+      <w:pPr>
+        <w:spacing w:after="120" w:line="269" w:lineRule="auto"/>
+      </w:pPr>
+      <w:r>
+        <w:t>Structured pruning là kỹ thuật loại bỏ có cấu trúc các filter, channel hoặc neuron không quan trọng thay vì chỉ đặt từng weight riêng lẻ về 0. Trong phương án này, kỹ thuật được áp dụng cho LeNet-5 ở phía FPGA; YOLOv5 và các bước OpenCV trên host không bị thay đổi bởi pruning của LeNet-5.</w:t>
+      </w:r>
+    </w:p>
+    <w:p>
+      <w:pPr>
+        <w:spacing w:after="120" w:line="269" w:lineRule="auto"/>
+      </w:pPr>
+      <w:r>
+        <w:t>Lợi ích chính của structured pruning là tạo ra một kiến trúc nhỏ hơn về mặt vật lý. Khi một channel của lớp convolution bị loại bỏ, số MAC ở lớp đó và lớp kế tiếp giảm theo; bộ nhớ feature map, số kết nối và số tài nguyên MAC cần triển khai cũng giảm. Vì vậy, Quartus có cơ sở để giảm ALM/DSP và cải thiện timing hoặc công suất. Đây là điểm khác biệt so với unstructured pruning: các weight bằng 0 vẫn có thể chiếm bộ nhớ và vẫn bị xử lý nếu accelerator không có cơ chế bỏ qua zero.</w:t>
+      </w:r>
+    </w:p>
+    <w:p>
+      <w:pPr>
+        <w:spacing w:after="120" w:line="269" w:lineRule="auto"/>
+      </w:pPr>
+      <w:r>
+        <w:t>Mục tiêu structured pruning 50% được hiểu là giảm xấp xỉ một nửa số filter/channel hoặc nhóm neuron theo tiêu chí đã chọn, không phải cam kết mọi lớp đều giảm đúng 50%. Sau khi loại bỏ cấu trúc, mô hình phải được fine-tune/retrain và đánh giá lại accuracy validation. Chỉ khi mô hình rút gọn được tổng hợp thành công trên Quartus mới được ghi nhận là giảm tài nguyên phần cứng thực tế.</w:t>
+      </w:r>
+    </w:p>
+    <w:tbl>
+      <w:tblPr>
+        <w:tblW w:type="auto" w:w="0"/>
+        <w:jc w:val="center"/>
+        <w:tblLayout w:type="fixed"/>
+        <w:tblLook w:firstColumn="1" w:firstRow="1" w:lastColumn="0" w:lastRow="0" w:noHBand="0" w:noVBand="1" w:val="04A0"/>
+      </w:tblPr>
+      <w:tblGrid>
+        <w:gridCol w:w="3312"/>
+        <w:gridCol w:w="3312"/>
+        <w:gridCol w:w="3312"/>
+      </w:tblGrid>
+      <w:tr>
+        <w:trPr>
+          <w:tblHeader w:val="true"/>
+        </w:trPr>
+        <w:tc>
+          <w:tcPr>
+            <w:tcW w:type="dxa" w:w="3312"/>
+            <w:vAlign w:val="center"/>
+            <w:shd w:fill="1F4E78"/>
+            <w:tcBorders>
+              <w:top w:val="single" w:sz="6" w:space="0" w:color="D9D9D9"/>
+              <w:left w:val="single" w:sz="6" w:space="0" w:color="D9D9D9"/>
+              <w:bottom w:val="single" w:sz="6" w:space="0" w:color="D9D9D9"/>
+              <w:right w:val="single" w:sz="6" w:space="0" w:color="D9D9D9"/>
+              <w:insideH w:val="single" w:sz="6" w:space="0" w:color="D9D9D9"/>
+              <w:insideV w:val="single" w:sz="6" w:space="0" w:color="D9D9D9"/>
+            </w:tcBorders>
+            <w:tcMar>
+              <w:top w:w="100" w:type="dxa"/>
+              <w:start w:w="120" w:type="dxa"/>
+              <w:bottom w:w="100" w:type="dxa"/>
+              <w:end w:w="120" w:type="dxa"/>
+            </w:tcMar>
+          </w:tcPr>
+          <w:p>
+            <w:pPr>
+              <w:jc w:val="center"/>
+            </w:pPr>
+            <w:r>
+              <w:rPr>
+                <w:b/>
+                <w:color w:val="FFFFFF"/>
+                <w:sz w:val="18"/>
+              </w:rPr>
+              <w:t>Kỹ thuật</w:t>
+            </w:r>
+          </w:p>
+        </w:tc>
+        <w:tc>
+          <w:tcPr>
+            <w:tcW w:type="dxa" w:w="3312"/>
+            <w:vAlign w:val="center"/>
+            <w:shd w:fill="1F4E78"/>
+            <w:tcBorders>
+              <w:top w:val="single" w:sz="6" w:space="0" w:color="D9D9D9"/>
+              <w:left w:val="single" w:sz="6" w:space="0" w:color="D9D9D9"/>
+              <w:bottom w:val="single" w:sz="6" w:space="0" w:color="D9D9D9"/>
+              <w:right w:val="single" w:sz="6" w:space="0" w:color="D9D9D9"/>
+              <w:insideH w:val="single" w:sz="6" w:space="0" w:color="D9D9D9"/>
+              <w:insideV w:val="single" w:sz="6" w:space="0" w:color="D9D9D9"/>
+            </w:tcBorders>
+            <w:tcMar>
+              <w:top w:w="100" w:type="dxa"/>
+              <w:start w:w="120" w:type="dxa"/>
+              <w:bottom w:w="100" w:type="dxa"/>
+              <w:end w:w="120" w:type="dxa"/>
+            </w:tcMar>
+          </w:tcPr>
+          <w:p>
+            <w:pPr>
+              <w:jc w:val="center"/>
+            </w:pPr>
+            <w:r>
+              <w:rPr>
+                <w:b/>
+                <w:color w:val="FFFFFF"/>
+                <w:sz w:val="18"/>
+              </w:rPr>
+              <w:t>Cách tác động</w:t>
+            </w:r>
+          </w:p>
+        </w:tc>
+        <w:tc>
+          <w:tcPr>
+            <w:tcW w:type="dxa" w:w="3312"/>
+            <w:vAlign w:val="center"/>
+            <w:shd w:fill="1F4E78"/>
+            <w:tcBorders>
+              <w:top w:val="single" w:sz="6" w:space="0" w:color="D9D9D9"/>
+              <w:left w:val="single" w:sz="6" w:space="0" w:color="D9D9D9"/>
+              <w:bottom w:val="single" w:sz="6" w:space="0" w:color="D9D9D9"/>
+              <w:right w:val="single" w:sz="6" w:space="0" w:color="D9D9D9"/>
+              <w:insideH w:val="single" w:sz="6" w:space="0" w:color="D9D9D9"/>
+              <w:insideV w:val="single" w:sz="6" w:space="0" w:color="D9D9D9"/>
+            </w:tcBorders>
+            <w:tcMar>
+              <w:top w:w="100" w:type="dxa"/>
+              <w:start w:w="120" w:type="dxa"/>
+              <w:bottom w:w="100" w:type="dxa"/>
+              <w:end w:w="120" w:type="dxa"/>
+            </w:tcMar>
+          </w:tcPr>
+          <w:p>
+            <w:pPr>
+              <w:jc w:val="center"/>
+            </w:pPr>
+            <w:r>
+              <w:rPr>
+                <w:b/>
+                <w:color w:val="FFFFFF"/>
+                <w:sz w:val="18"/>
+              </w:rPr>
+              <w:t>Ý nghĩa khi triển khai FPGA</w:t>
+            </w:r>
+          </w:p>
+        </w:tc>
+      </w:tr>
+      <w:tr>
+        <w:tc>
+          <w:tcPr>
+            <w:tcW w:type="dxa" w:w="2304"/>
+            <w:vAlign w:val="center"/>
+            <w:tcBorders>
+              <w:top w:val="single" w:sz="6" w:space="0" w:color="D9D9D9"/>
+              <w:left w:val="single" w:sz="6" w:space="0" w:color="D9D9D9"/>
+              <w:bottom w:val="single" w:sz="6" w:space="0" w:color="D9D9D9"/>
+              <w:right w:val="single" w:sz="6" w:space="0" w:color="D9D9D9"/>
+              <w:insideH w:val="single" w:sz="6" w:space="0" w:color="D9D9D9"/>
+              <w:insideV w:val="single" w:sz="6" w:space="0" w:color="D9D9D9"/>
+            </w:tcBorders>
+            <w:tcMar>
+              <w:top w:w="100" w:type="dxa"/>
+              <w:start w:w="120" w:type="dxa"/>
+              <w:bottom w:w="100" w:type="dxa"/>
+              <w:end w:w="120" w:type="dxa"/>
+            </w:tcMar>
+          </w:tcPr>
+          <w:p>
+            <w:pPr>
+              <w:spacing w:after="40"/>
+            </w:pPr>
+            <w:r>
+              <w:rPr>
+                <w:sz w:val="18"/>
+              </w:rPr>
+              <w:t>Unstructured pruning</w:t>
+            </w:r>
+          </w:p>
+        </w:tc>
+        <w:tc>
+          <w:tcPr>
+            <w:tcW w:type="dxa" w:w="3240"/>
+            <w:vAlign w:val="center"/>
+            <w:tcBorders>
+              <w:top w:val="single" w:sz="6" w:space="0" w:color="D9D9D9"/>
+              <w:left w:val="single" w:sz="6" w:space="0" w:color="D9D9D9"/>
+              <w:bottom w:val="single" w:sz="6" w:space="0" w:color="D9D9D9"/>
+              <w:right w:val="single" w:sz="6" w:space="0" w:color="D9D9D9"/>
+              <w:insideH w:val="single" w:sz="6" w:space="0" w:color="D9D9D9"/>
+              <w:insideV w:val="single" w:sz="6" w:space="0" w:color="D9D9D9"/>
+            </w:tcBorders>
+            <w:tcMar>
+              <w:top w:w="100" w:type="dxa"/>
+              <w:start w:w="120" w:type="dxa"/>
+              <w:bottom w:w="100" w:type="dxa"/>
+              <w:end w:w="120" w:type="dxa"/>
+            </w:tcMar>
+          </w:tcPr>
+          <w:p>
+            <w:pPr>
+              <w:spacing w:after="40"/>
+            </w:pPr>
+            <w:r>
+              <w:rPr>
+                <w:sz w:val="18"/>
+              </w:rPr>
+              <w:t>Đặt weight riêng lẻ về 0</w:t>
+            </w:r>
+          </w:p>
+        </w:tc>
+        <w:tc>
+          <w:tcPr>
+            <w:tcW w:type="dxa" w:w="4032"/>
+            <w:vAlign w:val="center"/>
+            <w:tcBorders>
+              <w:top w:val="single" w:sz="6" w:space="0" w:color="D9D9D9"/>
+              <w:left w:val="single" w:sz="6" w:space="0" w:color="D9D9D9"/>
+              <w:bottom w:val="single" w:sz="6" w:space="0" w:color="D9D9D9"/>
+              <w:right w:val="single" w:sz="6" w:space="0" w:color="D9D9D9"/>
+              <w:insideH w:val="single" w:sz="6" w:space="0" w:color="D9D9D9"/>
+              <w:insideV w:val="single" w:sz="6" w:space="0" w:color="D9D9D9"/>
+            </w:tcBorders>
+            <w:tcMar>
+              <w:top w:w="100" w:type="dxa"/>
+              <w:start w:w="120" w:type="dxa"/>
+              <w:bottom w:w="100" w:type="dxa"/>
+              <w:end w:w="120" w:type="dxa"/>
+            </w:tcMar>
+          </w:tcPr>
+          <w:p>
+            <w:pPr>
+              <w:spacing w:after="40"/>
+            </w:pPr>
+            <w:r>
+              <w:rPr>
+                <w:sz w:val="18"/>
+              </w:rPr>
+              <w:t>Giảm MAC hiệu dụng nếu accelerator hỗ trợ sparse execution; thường không giảm trực tiếp số DSP/ALM</w:t>
+            </w:r>
+          </w:p>
+        </w:tc>
+      </w:tr>
+      <w:tr>
+        <w:tc>
+          <w:tcPr>
+            <w:tcW w:type="dxa" w:w="2304"/>
+            <w:vAlign w:val="center"/>
+            <w:tcBorders>
+              <w:top w:val="single" w:sz="6" w:space="0" w:color="D9D9D9"/>
+              <w:left w:val="single" w:sz="6" w:space="0" w:color="D9D9D9"/>
+              <w:bottom w:val="single" w:sz="6" w:space="0" w:color="D9D9D9"/>
+              <w:right w:val="single" w:sz="6" w:space="0" w:color="D9D9D9"/>
+              <w:insideH w:val="single" w:sz="6" w:space="0" w:color="D9D9D9"/>
+              <w:insideV w:val="single" w:sz="6" w:space="0" w:color="D9D9D9"/>
+            </w:tcBorders>
+            <w:tcMar>
+              <w:top w:w="100" w:type="dxa"/>
+              <w:start w:w="120" w:type="dxa"/>
+              <w:bottom w:w="100" w:type="dxa"/>
+              <w:end w:w="120" w:type="dxa"/>
+            </w:tcMar>
+            <w:shd w:fill="F2F6FA"/>
+          </w:tcPr>
+          <w:p>
+            <w:pPr>
+              <w:spacing w:after="40"/>
+            </w:pPr>
+            <w:r>
+              <w:rPr>
+                <w:sz w:val="18"/>
+              </w:rPr>
+              <w:t>Structured channel pruning</w:t>
+            </w:r>
+          </w:p>
+        </w:tc>
+        <w:tc>
+          <w:tcPr>
+            <w:tcW w:type="dxa" w:w="3240"/>
+            <w:vAlign w:val="center"/>
+            <w:tcBorders>
+              <w:top w:val="single" w:sz="6" w:space="0" w:color="D9D9D9"/>
+              <w:left w:val="single" w:sz="6" w:space="0" w:color="D9D9D9"/>
+              <w:bottom w:val="single" w:sz="6" w:space="0" w:color="D9D9D9"/>
+              <w:right w:val="single" w:sz="6" w:space="0" w:color="D9D9D9"/>
+              <w:insideH w:val="single" w:sz="6" w:space="0" w:color="D9D9D9"/>
+              <w:insideV w:val="single" w:sz="6" w:space="0" w:color="D9D9D9"/>
+            </w:tcBorders>
+            <w:tcMar>
+              <w:top w:w="100" w:type="dxa"/>
+              <w:start w:w="120" w:type="dxa"/>
+              <w:bottom w:w="100" w:type="dxa"/>
+              <w:end w:w="120" w:type="dxa"/>
+            </w:tcMar>
+            <w:shd w:fill="F2F6FA"/>
+          </w:tcPr>
+          <w:p>
+            <w:pPr>
+              <w:spacing w:after="40"/>
+            </w:pPr>
+            <w:r>
+              <w:rPr>
+                <w:sz w:val="18"/>
+              </w:rPr>
+              <w:t>Loại bỏ filter/channel/neuron hoàn chỉnh</w:t>
+            </w:r>
+          </w:p>
+        </w:tc>
+        <w:tc>
+          <w:tcPr>
+            <w:tcW w:type="dxa" w:w="4032"/>
+            <w:vAlign w:val="center"/>
+            <w:tcBorders>
+              <w:top w:val="single" w:sz="6" w:space="0" w:color="D9D9D9"/>
+              <w:left w:val="single" w:sz="6" w:space="0" w:color="D9D9D9"/>
+              <w:bottom w:val="single" w:sz="6" w:space="0" w:color="D9D9D9"/>
+              <w:right w:val="single" w:sz="6" w:space="0" w:color="D9D9D9"/>
+              <w:insideH w:val="single" w:sz="6" w:space="0" w:color="D9D9D9"/>
+              <w:insideV w:val="single" w:sz="6" w:space="0" w:color="D9D9D9"/>
+            </w:tcBorders>
+            <w:tcMar>
+              <w:top w:w="100" w:type="dxa"/>
+              <w:start w:w="120" w:type="dxa"/>
+              <w:bottom w:w="100" w:type="dxa"/>
+              <w:end w:w="120" w:type="dxa"/>
+            </w:tcMar>
+            <w:shd w:fill="F2F6FA"/>
+          </w:tcPr>
+          <w:p>
+            <w:pPr>
+              <w:spacing w:after="40"/>
+            </w:pPr>
+            <w:r>
+              <w:rPr>
+                <w:sz w:val="18"/>
+              </w:rPr>
+              <w:t>Giảm kích thước tensor, MAC, bộ nhớ và tài nguyên phần cứng sau khi compile lại</w:t>
+            </w:r>
+          </w:p>
+        </w:tc>
+      </w:tr>
+      <w:tr>
+        <w:tc>
+          <w:tcPr>
+            <w:tcW w:type="dxa" w:w="2304"/>
+            <w:vAlign w:val="center"/>
+            <w:tcBorders>
+              <w:top w:val="single" w:sz="6" w:space="0" w:color="D9D9D9"/>
+              <w:left w:val="single" w:sz="6" w:space="0" w:color="D9D9D9"/>
+              <w:bottom w:val="single" w:sz="6" w:space="0" w:color="D9D9D9"/>
+              <w:right w:val="single" w:sz="6" w:space="0" w:color="D9D9D9"/>
+              <w:insideH w:val="single" w:sz="6" w:space="0" w:color="D9D9D9"/>
+              <w:insideV w:val="single" w:sz="6" w:space="0" w:color="D9D9D9"/>
+            </w:tcBorders>
+            <w:tcMar>
+              <w:top w:w="100" w:type="dxa"/>
+              <w:start w:w="120" w:type="dxa"/>
+              <w:bottom w:w="100" w:type="dxa"/>
+              <w:end w:w="120" w:type="dxa"/>
+            </w:tcMar>
+          </w:tcPr>
+          <w:p>
+            <w:pPr>
+              <w:spacing w:after="40"/>
+            </w:pPr>
+            <w:r>
+              <w:rPr>
+                <w:sz w:val="18"/>
+              </w:rPr>
+              <w:t>INT8 quantization</w:t>
+            </w:r>
+          </w:p>
+        </w:tc>
+        <w:tc>
+          <w:tcPr>
+            <w:tcW w:type="dxa" w:w="3240"/>
+            <w:vAlign w:val="center"/>
+            <w:tcBorders>
+              <w:top w:val="single" w:sz="6" w:space="0" w:color="D9D9D9"/>
+              <w:left w:val="single" w:sz="6" w:space="0" w:color="D9D9D9"/>
+              <w:bottom w:val="single" w:sz="6" w:space="0" w:color="D9D9D9"/>
+              <w:right w:val="single" w:sz="6" w:space="0" w:color="D9D9D9"/>
+              <w:insideH w:val="single" w:sz="6" w:space="0" w:color="D9D9D9"/>
+              <w:insideV w:val="single" w:sz="6" w:space="0" w:color="D9D9D9"/>
+            </w:tcBorders>
+            <w:tcMar>
+              <w:top w:w="100" w:type="dxa"/>
+              <w:start w:w="120" w:type="dxa"/>
+              <w:bottom w:w="100" w:type="dxa"/>
+              <w:end w:w="120" w:type="dxa"/>
+            </w:tcMar>
+          </w:tcPr>
+          <w:p>
+            <w:pPr>
+              <w:spacing w:after="40"/>
+            </w:pPr>
+            <w:r>
+              <w:rPr>
+                <w:sz w:val="18"/>
+              </w:rPr>
+              <w:t>Đổi dữ liệu và trọng số sang 8 bit</w:t>
+            </w:r>
+          </w:p>
+        </w:tc>
+        <w:tc>
+          <w:tcPr>
+            <w:tcW w:type="dxa" w:w="4032"/>
+            <w:vAlign w:val="center"/>
+            <w:tcBorders>
+              <w:top w:val="single" w:sz="6" w:space="0" w:color="D9D9D9"/>
+              <w:left w:val="single" w:sz="6" w:space="0" w:color="D9D9D9"/>
+              <w:bottom w:val="single" w:sz="6" w:space="0" w:color="D9D9D9"/>
+              <w:right w:val="single" w:sz="6" w:space="0" w:color="D9D9D9"/>
+              <w:insideH w:val="single" w:sz="6" w:space="0" w:color="D9D9D9"/>
+              <w:insideV w:val="single" w:sz="6" w:space="0" w:color="D9D9D9"/>
+            </w:tcBorders>
+            <w:tcMar>
+              <w:top w:w="100" w:type="dxa"/>
+              <w:start w:w="120" w:type="dxa"/>
+              <w:bottom w:w="100" w:type="dxa"/>
+              <w:end w:w="120" w:type="dxa"/>
+            </w:tcMar>
+          </w:tcPr>
+          <w:p>
+            <w:pPr>
+              <w:spacing w:after="40"/>
+            </w:pPr>
+            <w:r>
+              <w:rPr>
+                <w:sz w:val="18"/>
+              </w:rPr>
+              <w:t>Giảm bộ nhớ, độ rộng mạch và chi phí truyền; không thay thế pruning</w:t>
+            </w:r>
+          </w:p>
+        </w:tc>
+      </w:tr>
+    </w:tbl>
+    <w:p>
+      <w:pPr>
+        <w:spacing w:after="40"/>
+      </w:pPr>
+    </w:p>
+    <w:p>
+      <w:pPr>
+        <w:spacing w:after="120" w:line="269" w:lineRule="auto"/>
+      </w:pPr>
+      <w:r>
+        <w:t>Do đó, báo cáo phân biệt rõ hai con số: MAC lý thuyết của kiến trúc dense và MAC hiệu dụng của checkpoint unstructured hiện tại. Khi hoàn tất structured pruning, cần bổ sung thêm MAC của kiến trúc rút gọn và kết quả Quartus gồm ALM, DSP, memory bits, fMAX, latency và công suất để chứng minh mức tối ưu thực tế.</w:t>
+      </w:r>
+    </w:p>
+    <w:p>
+      <w:pPr>
         <w:pStyle w:val="Heading1"/>
         <w:keepNext/>
       </w:pPr>
@@ -6296,56 +6750,50 @@
     </w:p>
     <w:p>
       <w:pPr>
-        <w:pStyle w:val="ListNumber"/>
         <w:spacing w:after="60"/>
       </w:pPr>
       <w:r>
-        <w:t>LeCun, Y., Bottou, L., Bengio, Y., Haffner, P. Gradient-Based Learning Applied to Document Recognition. Proceedings of the IEEE, 1998.</w:t>
+        <w:t>1. LeCun, Y., Bottou, L., Bengio, Y., Haffner, P. Gradient-Based Learning Applied to Document Recognition. Proceedings of the IEEE, 1998.</w:t>
       </w:r>
     </w:p>
     <w:p>
       <w:pPr>
-        <w:pStyle w:val="ListNumber"/>
         <w:spacing w:after="60"/>
       </w:pPr>
       <w:r>
-        <w:t>Han, S., Pool, J., Tran, J., Dally, W. J. Learning Both Weights and Connections for Efficient Neural Networks. NeurIPS, 2015.</w:t>
+        <w:t>2. Han, S., Pool, J., Tran, J., Dally, W. J. Learning Both Weights and Connections for Efficient Neural Networks. NeurIPS, 2015.</w:t>
       </w:r>
     </w:p>
     <w:p>
       <w:pPr>
-        <w:pStyle w:val="ListNumber"/>
         <w:spacing w:after="60"/>
       </w:pPr>
       <w:r>
-        <w:t>Molchanov, P., Tyree, S., Karras, T., Aila, T., Kautz, J. Pruning Convolutional Neural Networks for Resource Efficient Inference. ICLR, 2017.</w:t>
+        <w:t>3. Molchanov, P., Tyree, S., Karras, T., Aila, T., Kautz, J. Pruning Convolutional Neural Networks for Resource Efficient Inference. ICLR, 2017.</w:t>
       </w:r>
     </w:p>
     <w:p>
       <w:pPr>
-        <w:pStyle w:val="ListNumber"/>
         <w:spacing w:after="60"/>
       </w:pPr>
       <w:r>
-        <w:t>PyTorch Documentation. Conv2d module and tensor shape definition.</w:t>
+        <w:t>4. PyTorch Documentation. Conv2d module and tensor shape definition.</w:t>
       </w:r>
     </w:p>
     <w:p>
       <w:pPr>
-        <w:pStyle w:val="ListNumber"/>
         <w:spacing w:after="60"/>
       </w:pPr>
       <w:r>
-        <w:t>Terasic. DE10-Lite Development and Education Board.</w:t>
+        <w:t>5. Terasic. DE10-Lite Development and Education Board.</w:t>
       </w:r>
     </w:p>
     <w:p>
       <w:pPr>
-        <w:pStyle w:val="ListNumber"/>
         <w:spacing w:after="60"/>
       </w:pPr>
       <w:r>
-        <w:t>Double-Row License Plate Segmentation with Convolutional Neural Networks. Journal of Computer-Aided Design and Computer Graphics, 2019.</w:t>
+        <w:t>6. Double-Row License Plate Segmentation with Convolutional Neural Networks. Journal of Computer-Aided Design and Computer Graphics, 2019.</w:t>
       </w:r>
     </w:p>
     <w:p>

</xml_diff>